<commit_message>
fixing document format and typo
</commit_message>
<xml_diff>
--- a/week5/Stage_2_SmartCare_v02_Requirements_Template.docx
+++ b/week5/Stage_2_SmartCare_v02_Requirements_Template.docx
@@ -231,31 +231,7 @@
     <w:p/>
     <w:p>
       <w:r>
-        <w:t>Key stakeholder conflicts: Patients want speed and minimal friction, which</w:t>
-      </w:r>
-      <w:r>
-        <w:t xml:space="preserve"> </w:t>
-      </w:r>
-      <w:r>
-        <w:t>conflicts with management's need for complete, validated data. Reception</w:t>
-      </w:r>
-      <w:r>
-        <w:t xml:space="preserve"> </w:t>
-      </w:r>
-      <w:r>
-        <w:t>staff want flexibility to book any requested time, which conflicts with</w:t>
-      </w:r>
-      <w:r>
-        <w:t xml:space="preserve"> </w:t>
-      </w:r>
-      <w:r>
-        <w:t>practitioners' need for a protected, predictable schedule free of</w:t>
-      </w:r>
-      <w:r>
-        <w:t xml:space="preserve"> </w:t>
-      </w:r>
-      <w:r>
-        <w:t>double-bookings.</w:t>
+        <w:t>Key stakeholder conflicts: Patients want speed and minimal friction, which conflicts with management's need for complete, validated data. Reception staff want flexibility to book any requested time, which conflicts with practitioners' need for a protected, predictable schedule free of double-bookings.</w:t>
       </w:r>
     </w:p>
     <w:p>
@@ -271,10 +247,7 @@
         <w:t>FR-01:</w:t>
       </w:r>
       <w:r>
-        <w:t xml:space="preserve"> </w:t>
-      </w:r>
-      <w:r>
-        <w:t>The system shall allow staff to book a new appointment by recording patient name, practitioner name, and appointment time.</w:t>
+        <w:t xml:space="preserve"> The system shall allow staff to book a new appointment by recording patient name, practitioner name and appointment time.</w:t>
       </w:r>
     </w:p>
     <w:p>
@@ -290,13 +263,7 @@
         <w:t xml:space="preserve">FR-03: </w:t>
       </w:r>
       <w:r>
-        <w:t xml:space="preserve">The system shall reject a booking if the </w:t>
-      </w:r>
-      <w:r>
-        <w:t>patient’s</w:t>
-      </w:r>
-      <w:r>
-        <w:t xml:space="preserve"> name is blank.</w:t>
+        <w:t>The system shall reject a booking if the patient’s name is blank.</w:t>
       </w:r>
     </w:p>
     <w:p>
@@ -340,7 +307,7 @@
         <w:t xml:space="preserve">FR-07: </w:t>
       </w:r>
       <w:r>
-        <w:t>The system shall detect and warn staff when a new booking exactly duplicates an existing appointment (same patient, practitioner, and time).</w:t>
+        <w:t>The system shall detect and warn staff when a new booking exactly duplicates an existing appointment (same patient, practitioner and time).</w:t>
       </w:r>
     </w:p>
     <w:p>
@@ -393,10 +360,7 @@
     </w:p>
     <w:p>
       <w:r>
-        <w:t xml:space="preserve">NFR-01: </w:t>
-      </w:r>
-      <w:r>
-        <w:t>The system shall remain responsive when handling a course-scale dataset (up to a few hundred appointments).</w:t>
+        <w:t>NFR-01: The system shall remain responsive, with no noticeable delay, when handling a course-scale dataset (up to a few hundred appointments).</w:t>
       </w:r>
     </w:p>
     <w:p>
@@ -449,7 +413,7 @@
     </w:p>
     <w:p>
       <w:r>
-        <w:t>US-01: As a receptionist, I want to book an appointment with patient, practitioner, and time, so that I can record client visits accurately.</w:t>
+        <w:t>US-01: As a receptionist, I want to book an appointment with patient, practitioner and time, so that I can record client visits accurately.</w:t>
       </w:r>
     </w:p>
     <w:p>
@@ -523,7 +487,7 @@
         <w:t xml:space="preserve">GIVEN </w:t>
       </w:r>
       <w:r>
-        <w:t>a receptionist has entered a valid patient name, practitioner name, and appointment time</w:t>
+        <w:t>a receptionist has entered a valid patient name, practitioner name and appointment time</w:t>
       </w:r>
       <w:r>
         <w:br/>
@@ -545,13 +509,7 @@
         <w:t xml:space="preserve">GIVEN </w:t>
       </w:r>
       <w:r>
-        <w:t xml:space="preserve">a receptionist has left the </w:t>
-      </w:r>
-      <w:r>
-        <w:t>patient’s</w:t>
-      </w:r>
-      <w:r>
-        <w:t xml:space="preserve"> name blank</w:t>
+        <w:t>a receptionist has left the patient’s name blank</w:t>
       </w:r>
       <w:r>
         <w:br/>
@@ -606,69 +564,27 @@
     </w:p>
     <w:p>
       <w:r>
-        <w:t>- Assumed patients are identified by name only at this stage (no unique</w:t>
-      </w:r>
-      <w:r>
-        <w:t xml:space="preserve"> </w:t>
-      </w:r>
-      <w:r>
-        <w:t>patient ID yet -- flagged as an open question).</w:t>
+        <w:t>- Assumed patients are identified by name only at this stage (no unique patient ID yet -- flagged as an open question).</w:t>
       </w:r>
     </w:p>
     <w:p>
       <w:r>
-        <w:t>- Assumed "blank" means an empty string or None value; whitespace-only</w:t>
-      </w:r>
-      <w:r>
-        <w:t xml:space="preserve"> </w:t>
-      </w:r>
-      <w:r>
-        <w:t>input is not yet explicitly handled -- flagged by AI review, needs decision.</w:t>
+        <w:t>- Assumed "blank" means an empty string or None value; whitespace-only input is not yet explicitly handled -- flagged by AI review, needs decision.</w:t>
       </w:r>
     </w:p>
     <w:p>
       <w:r>
-        <w:t>- Unclear whether cancelled appointments should appear in the main</w:t>
-      </w:r>
-      <w:r>
-        <w:t xml:space="preserve"> </w:t>
-      </w:r>
-      <w:r>
-        <w:t xml:space="preserve">appointment list, patient history, or practitioner schedule </w:t>
-      </w:r>
-      <w:r>
-        <w:t>–</w:t>
-      </w:r>
-      <w:r>
-        <w:t xml:space="preserve"> flagged</w:t>
-      </w:r>
-      <w:r>
-        <w:t xml:space="preserve"> </w:t>
-      </w:r>
-      <w:r>
-        <w:t>consistently by AI review across multiple requirements.</w:t>
+        <w:t>- Unclear whether cancelled appointments should appear in the main appointment list, patient history, or practitioner schedule – flagged consistently by AI review across multiple requirements.</w:t>
       </w:r>
     </w:p>
     <w:p>
       <w:r>
-        <w:t>- Unclear whether the duplicate-booking warning (FR-07) should block the</w:t>
-      </w:r>
-      <w:r>
-        <w:t xml:space="preserve"> </w:t>
-      </w:r>
-      <w:r>
-        <w:t>booking outright or just alert staff with an option to proceed anyway.</w:t>
+        <w:t>- Unclear whether the duplicate-booking warning (FR-07) should block the booking outright or just alert staff with an option to proceed anyway.</w:t>
       </w:r>
     </w:p>
     <w:p>
       <w:r>
-        <w:t>- Open question: what time format should be enforced (currently accepted</w:t>
-      </w:r>
-      <w:r>
-        <w:t xml:space="preserve"> </w:t>
-      </w:r>
-      <w:r>
-        <w:t>as free text)?</w:t>
+        <w:t>- Open question: what time format should be enforced (currently accepted as free text)?</w:t>
       </w:r>
     </w:p>
     <w:p>
@@ -2236,6 +2152,7 @@
   <w:style w:type="character" w:default="1" w:styleId="DefaultParagraphFont">
     <w:name w:val="Default Paragraph Font"/>
     <w:uiPriority w:val="1"/>
+    <w:semiHidden/>
     <w:unhideWhenUsed/>
   </w:style>
   <w:style w:type="table" w:default="1" w:styleId="TableNormal">

</xml_diff>